<commit_message>
Show the test results as evidence: results script and its output in the document and README
- src/show_results.py recomputes accuracy, delays caught, ROC-AUC and hours error from the saved 2024 predictions
- Its output is shown as a figure before the app screenshots (project document and README)
- Project document: subtitle and name lines removed
</commit_message>
<xml_diff>
--- a/report/final/project_document.docx
+++ b/report/final/project_document.docx
@@ -13,27 +13,6 @@
           <w:color w:val="000000"/>
         </w:rPr>
         <w:t>Predicting Port Congestion and Ship Delays</w:t>
-      </w:r>
-    </w:p>
-    <w:p>
-      <w:r>
-        <w:rPr>
-          <w:rFonts w:ascii="Times New Roman" w:hAnsi="Times New Roman" w:eastAsia="Times New Roman"/>
-          <w:b/>
-          <w:color w:val="000000"/>
-        </w:rPr>
-        <w:t>Will this ship wait more than 24 hours for a berth, how sure are we, and why?</w:t>
-      </w:r>
-    </w:p>
-    <w:p>
-      <w:r>
-        <w:rPr>
-          <w:rFonts w:ascii="Times New Roman" w:hAnsi="Times New Roman" w:eastAsia="Times New Roman"/>
-          <w:b w:val="0"/>
-          <w:i/>
-          <w:color w:val="000000"/>
-        </w:rPr>
-        <w:t>[Your name] · Aiqon AI Internship assignment · October 2026</w:t>
       </w:r>
     </w:p>
     <w:p>
@@ -1232,6 +1211,79 @@
     </w:tbl>
     <w:p/>
     <w:p>
+      <w:r>
+        <w:rPr>
+          <w:rFonts w:ascii="Times New Roman" w:hAnsi="Times New Roman" w:eastAsia="Times New Roman"/>
+          <w:b w:val="0"/>
+          <w:color w:val="000000"/>
+        </w:rPr>
+        <w:t xml:space="preserve">These numbers can be reproduced by running </w:t>
+      </w:r>
+      <w:r>
+        <w:rPr>
+          <w:rFonts w:ascii="Times New Roman" w:hAnsi="Times New Roman" w:eastAsia="Times New Roman"/>
+          <w:b w:val="0"/>
+          <w:color w:val="000000"/>
+        </w:rPr>
+        <w:t>python src/show_results.py</w:t>
+      </w:r>
+      <w:r>
+        <w:rPr>
+          <w:rFonts w:ascii="Times New Roman" w:hAnsi="Times New Roman" w:eastAsia="Times New Roman"/>
+          <w:b w:val="0"/>
+          <w:color w:val="000000"/>
+        </w:rPr>
+        <w:t>, which recomputes them from the saved 2024 predictions:</w:t>
+      </w:r>
+    </w:p>
+    <w:p>
+      <w:r>
+        <w:drawing>
+          <wp:inline xmlns:a="http://schemas.openxmlformats.org/drawingml/2006/main" xmlns:pic="http://schemas.openxmlformats.org/drawingml/2006/picture">
+            <wp:extent cx="4206240" cy="2361793"/>
+            <wp:docPr id="1" name="Picture 1"/>
+            <wp:cNvGraphicFramePr>
+              <a:graphicFrameLocks noChangeAspect="1"/>
+            </wp:cNvGraphicFramePr>
+            <a:graphic>
+              <a:graphicData uri="http://schemas.openxmlformats.org/drawingml/2006/picture">
+                <pic:pic>
+                  <pic:nvPicPr>
+                    <pic:cNvPr id="0" name="results_terminal.png"/>
+                    <pic:cNvPicPr/>
+                  </pic:nvPicPr>
+                  <pic:blipFill>
+                    <a:blip r:embed="rId9"/>
+                    <a:stretch>
+                      <a:fillRect/>
+                    </a:stretch>
+                  </pic:blipFill>
+                  <pic:spPr>
+                    <a:xfrm>
+                      <a:off x="0" y="0"/>
+                      <a:ext cx="4206240" cy="2361793"/>
+                    </a:xfrm>
+                    <a:prstGeom prst="rect"/>
+                  </pic:spPr>
+                </pic:pic>
+              </a:graphicData>
+            </a:graphic>
+          </wp:inline>
+        </w:drawing>
+      </w:r>
+    </w:p>
+    <w:p>
+      <w:r>
+        <w:rPr>
+          <w:rFonts w:ascii="Times New Roman" w:hAnsi="Times New Roman" w:eastAsia="Times New Roman"/>
+          <w:b w:val="0"/>
+          <w:i/>
+          <w:color w:val="000000"/>
+        </w:rPr>
+        <w:t>Figure 1. Output of the results script on the 2024 test set.</w:t>
+      </w:r>
+    </w:p>
+    <w:p>
       <w:pPr>
         <w:pStyle w:val="Heading1"/>
       </w:pPr>
@@ -1602,7 +1654,7 @@
         <w:drawing>
           <wp:inline xmlns:a="http://schemas.openxmlformats.org/drawingml/2006/main" xmlns:pic="http://schemas.openxmlformats.org/drawingml/2006/picture">
             <wp:extent cx="5486400" cy="3887845"/>
-            <wp:docPr id="1" name="Picture 1"/>
+            <wp:docPr id="2" name="Picture 2"/>
             <wp:cNvGraphicFramePr>
               <a:graphicFrameLocks noChangeAspect="1"/>
             </wp:cNvGraphicFramePr>
@@ -1614,7 +1666,7 @@
                     <pic:cNvPicPr/>
                   </pic:nvPicPr>
                   <pic:blipFill>
-                    <a:blip r:embed="rId9"/>
+                    <a:blip r:embed="rId10"/>
                     <a:stretch>
                       <a:fillRect/>
                     </a:stretch>
@@ -1641,7 +1693,7 @@
           <w:i/>
           <w:color w:val="000000"/>
         </w:rPr>
-        <w:t>Figure 1. Choosing a ship and reading its prediction.</w:t>
+        <w:t>Figure 2. Choosing a ship and reading its prediction.</w:t>
       </w:r>
     </w:p>
     <w:p>
@@ -2055,7 +2107,7 @@
         <w:drawing>
           <wp:inline xmlns:a="http://schemas.openxmlformats.org/drawingml/2006/main" xmlns:pic="http://schemas.openxmlformats.org/drawingml/2006/picture">
             <wp:extent cx="5486400" cy="2689109"/>
-            <wp:docPr id="2" name="Picture 2"/>
+            <wp:docPr id="3" name="Picture 3"/>
             <wp:cNvGraphicFramePr>
               <a:graphicFrameLocks noChangeAspect="1"/>
             </wp:cNvGraphicFramePr>
@@ -2067,7 +2119,7 @@
                     <pic:cNvPicPr/>
                   </pic:nvPicPr>
                   <pic:blipFill>
-                    <a:blip r:embed="rId10"/>
+                    <a:blip r:embed="rId11"/>
                     <a:stretch>
                       <a:fillRect/>
                     </a:stretch>
@@ -2094,7 +2146,7 @@
           <w:i/>
           <w:color w:val="000000"/>
         </w:rPr>
-        <w:t>Figure 2. Why the ship is likely to be delayed, and how today differs from a normal day.</w:t>
+        <w:t>Figure 3. Why the ship is likely to be delayed, and how today differs from a normal day.</w:t>
       </w:r>
     </w:p>
     <w:p>

</xml_diff>

<commit_message>
Results section: stats screenshot first, then the app screenshots (document and README)
</commit_message>
<xml_diff>
--- a/report/final/project_document.docx
+++ b/report/final/project_document.docx
@@ -1211,79 +1211,6 @@
     </w:tbl>
     <w:p/>
     <w:p>
-      <w:r>
-        <w:rPr>
-          <w:rFonts w:ascii="Times New Roman" w:hAnsi="Times New Roman" w:eastAsia="Times New Roman"/>
-          <w:b w:val="0"/>
-          <w:color w:val="000000"/>
-        </w:rPr>
-        <w:t xml:space="preserve">These numbers can be reproduced by running </w:t>
-      </w:r>
-      <w:r>
-        <w:rPr>
-          <w:rFonts w:ascii="Times New Roman" w:hAnsi="Times New Roman" w:eastAsia="Times New Roman"/>
-          <w:b w:val="0"/>
-          <w:color w:val="000000"/>
-        </w:rPr>
-        <w:t>python src/show_results.py</w:t>
-      </w:r>
-      <w:r>
-        <w:rPr>
-          <w:rFonts w:ascii="Times New Roman" w:hAnsi="Times New Roman" w:eastAsia="Times New Roman"/>
-          <w:b w:val="0"/>
-          <w:color w:val="000000"/>
-        </w:rPr>
-        <w:t>, which recomputes them from the saved 2024 predictions:</w:t>
-      </w:r>
-    </w:p>
-    <w:p>
-      <w:r>
-        <w:drawing>
-          <wp:inline xmlns:a="http://schemas.openxmlformats.org/drawingml/2006/main" xmlns:pic="http://schemas.openxmlformats.org/drawingml/2006/picture">
-            <wp:extent cx="4206240" cy="2361793"/>
-            <wp:docPr id="1" name="Picture 1"/>
-            <wp:cNvGraphicFramePr>
-              <a:graphicFrameLocks noChangeAspect="1"/>
-            </wp:cNvGraphicFramePr>
-            <a:graphic>
-              <a:graphicData uri="http://schemas.openxmlformats.org/drawingml/2006/picture">
-                <pic:pic>
-                  <pic:nvPicPr>
-                    <pic:cNvPr id="0" name="results_terminal.png"/>
-                    <pic:cNvPicPr/>
-                  </pic:nvPicPr>
-                  <pic:blipFill>
-                    <a:blip r:embed="rId9"/>
-                    <a:stretch>
-                      <a:fillRect/>
-                    </a:stretch>
-                  </pic:blipFill>
-                  <pic:spPr>
-                    <a:xfrm>
-                      <a:off x="0" y="0"/>
-                      <a:ext cx="4206240" cy="2361793"/>
-                    </a:xfrm>
-                    <a:prstGeom prst="rect"/>
-                  </pic:spPr>
-                </pic:pic>
-              </a:graphicData>
-            </a:graphic>
-          </wp:inline>
-        </w:drawing>
-      </w:r>
-    </w:p>
-    <w:p>
-      <w:r>
-        <w:rPr>
-          <w:rFonts w:ascii="Times New Roman" w:hAnsi="Times New Roman" w:eastAsia="Times New Roman"/>
-          <w:b w:val="0"/>
-          <w:i/>
-          <w:color w:val="000000"/>
-        </w:rPr>
-        <w:t>Figure 1. Output of the results script on the 2024 test set.</w:t>
-      </w:r>
-    </w:p>
-    <w:p>
       <w:pPr>
         <w:pStyle w:val="Heading1"/>
       </w:pPr>
@@ -1627,6 +1554,11 @@
       </w:r>
     </w:p>
     <w:p>
+      <w:r>
+        <w:br w:type="page"/>
+      </w:r>
+    </w:p>
+    <w:p>
       <w:pPr>
         <w:pStyle w:val="Heading1"/>
       </w:pPr>
@@ -1636,7 +1568,7 @@
           <w:b/>
           <w:color w:val="000000"/>
         </w:rPr>
-        <w:t>4. The system in use</w:t>
+        <w:t>4. Results</w:t>
       </w:r>
     </w:p>
     <w:p>
@@ -1646,7 +1578,80 @@
           <w:b w:val="0"/>
           <w:color w:val="000000"/>
         </w:rPr>
-        <w:t>Both figures show one real case: a container ship arriving at the TCP terminal in Paranaguá on 1 January 2024. The system gave a 55% chance of delay; the ship really waited 46 hours.</w:t>
+        <w:t xml:space="preserve">The results on the 2024 test set can be reproduced by running </w:t>
+      </w:r>
+      <w:r>
+        <w:rPr>
+          <w:rFonts w:ascii="Times New Roman" w:hAnsi="Times New Roman" w:eastAsia="Times New Roman"/>
+          <w:b w:val="0"/>
+          <w:color w:val="000000"/>
+        </w:rPr>
+        <w:t>python src/show_results.py</w:t>
+      </w:r>
+      <w:r>
+        <w:rPr>
+          <w:rFonts w:ascii="Times New Roman" w:hAnsi="Times New Roman" w:eastAsia="Times New Roman"/>
+          <w:b w:val="0"/>
+          <w:color w:val="000000"/>
+        </w:rPr>
+        <w:t>, which recomputes them from the saved predictions:</w:t>
+      </w:r>
+    </w:p>
+    <w:p>
+      <w:r>
+        <w:drawing>
+          <wp:inline xmlns:a="http://schemas.openxmlformats.org/drawingml/2006/main" xmlns:pic="http://schemas.openxmlformats.org/drawingml/2006/picture">
+            <wp:extent cx="4206240" cy="2361793"/>
+            <wp:docPr id="1" name="Picture 1"/>
+            <wp:cNvGraphicFramePr>
+              <a:graphicFrameLocks noChangeAspect="1"/>
+            </wp:cNvGraphicFramePr>
+            <a:graphic>
+              <a:graphicData uri="http://schemas.openxmlformats.org/drawingml/2006/picture">
+                <pic:pic>
+                  <pic:nvPicPr>
+                    <pic:cNvPr id="0" name="results_terminal.png"/>
+                    <pic:cNvPicPr/>
+                  </pic:nvPicPr>
+                  <pic:blipFill>
+                    <a:blip r:embed="rId9"/>
+                    <a:stretch>
+                      <a:fillRect/>
+                    </a:stretch>
+                  </pic:blipFill>
+                  <pic:spPr>
+                    <a:xfrm>
+                      <a:off x="0" y="0"/>
+                      <a:ext cx="4206240" cy="2361793"/>
+                    </a:xfrm>
+                    <a:prstGeom prst="rect"/>
+                  </pic:spPr>
+                </pic:pic>
+              </a:graphicData>
+            </a:graphic>
+          </wp:inline>
+        </w:drawing>
+      </w:r>
+    </w:p>
+    <w:p>
+      <w:r>
+        <w:rPr>
+          <w:rFonts w:ascii="Times New Roman" w:hAnsi="Times New Roman" w:eastAsia="Times New Roman"/>
+          <w:b w:val="0"/>
+          <w:i/>
+          <w:color w:val="000000"/>
+        </w:rPr>
+        <w:t>Figure 1. Output of the results script on the 2024 test set.</w:t>
+      </w:r>
+    </w:p>
+    <w:p>
+      <w:r>
+        <w:rPr>
+          <w:rFonts w:ascii="Times New Roman" w:hAnsi="Times New Roman" w:eastAsia="Times New Roman"/>
+          <w:b w:val="0"/>
+          <w:color w:val="000000"/>
+        </w:rPr>
+        <w:t>Figures 2 and 3 show one real case: a container ship arriving at the TCP terminal in Paranaguá on 1 January 2024. The system gave a 55% chance of delay; the ship really waited 46 hours.</w:t>
       </w:r>
     </w:p>
     <w:p>

</xml_diff>